<commit_message>
feat: complete M1 controllable MES demo loop
</commit_message>
<xml_diff>
--- a/MES智能制造运营平台设计与实施方案.docx
+++ b/MES智能制造运营平台设计与实施方案.docx
@@ -145,6 +145,10 @@
         <w:gridCol w:w="4896"/>
       </w:tblGrid>
       <w:tr>
+        <w:trPr>
+          <w:tblHeader w:val="true"/>
+          <w:cantSplit/>
+        </w:trPr>
         <w:tc>
           <w:tcPr>
             <w:tcW w:w="2232" w:type="dxa"/>
@@ -225,6 +229,9 @@
         </w:tc>
       </w:tr>
       <w:tr>
+        <w:trPr>
+          <w:cantSplit/>
+        </w:trPr>
         <w:tc>
           <w:tcPr>
             <w:tcW w:w="4896" w:type="dxa"/>
@@ -303,6 +310,9 @@
         </w:tc>
       </w:tr>
       <w:tr>
+        <w:trPr>
+          <w:cantSplit/>
+        </w:trPr>
         <w:tc>
           <w:tcPr>
             <w:tcW w:w="4896" w:type="dxa"/>
@@ -381,6 +391,9 @@
         </w:tc>
       </w:tr>
       <w:tr>
+        <w:trPr>
+          <w:cantSplit/>
+        </w:trPr>
         <w:tc>
           <w:tcPr>
             <w:tcW w:w="4896" w:type="dxa"/>
@@ -439,26 +452,16 @@
             <w:vAlign w:val="center"/>
           </w:tcPr>
           <w:p>
-            <w:pPr>
-              <w:spacing w:after="0"/>
-              <w:rPr>
-                <w:rFonts w:hint="eastAsia" w:asciiTheme="majorEastAsia" w:hAnsiTheme="majorEastAsia" w:eastAsiaTheme="majorEastAsia" w:cstheme="majorEastAsia"/>
-              </w:rPr>
-            </w:pPr>
-            <w:r>
-              <w:rPr>
-                <w:rFonts w:hint="eastAsia" w:asciiTheme="majorEastAsia" w:hAnsiTheme="majorEastAsia" w:eastAsiaTheme="majorEastAsia" w:cstheme="majorEastAsia"/>
-                <w:b w:val="0"/>
-                <w:i w:val="0"/>
-                <w:color w:val="1F2937"/>
-                <w:sz w:val="18"/>
-              </w:rPr>
-              <w:t>V1.0</w:t>
+            <w:r>
+              <w:t>V1.1</w:t>
             </w:r>
           </w:p>
         </w:tc>
       </w:tr>
       <w:tr>
+        <w:trPr>
+          <w:cantSplit/>
+        </w:trPr>
         <w:tc>
           <w:tcPr>
             <w:tcW w:w="4896" w:type="dxa"/>
@@ -517,26 +520,16 @@
             <w:vAlign w:val="center"/>
           </w:tcPr>
           <w:p>
-            <w:pPr>
-              <w:spacing w:after="0"/>
-              <w:rPr>
-                <w:rFonts w:hint="eastAsia" w:asciiTheme="majorEastAsia" w:hAnsiTheme="majorEastAsia" w:eastAsiaTheme="majorEastAsia" w:cstheme="majorEastAsia"/>
-              </w:rPr>
-            </w:pPr>
-            <w:r>
-              <w:rPr>
-                <w:rFonts w:hint="eastAsia" w:asciiTheme="majorEastAsia" w:hAnsiTheme="majorEastAsia" w:eastAsiaTheme="majorEastAsia" w:cstheme="majorEastAsia"/>
-                <w:b w:val="0"/>
-                <w:i w:val="0"/>
-                <w:color w:val="1F2937"/>
-                <w:sz w:val="18"/>
-              </w:rPr>
-              <w:t>2026年8月28日</w:t>
+            <w:r>
+              <w:t>2026 年 8 月 29 日</w:t>
             </w:r>
           </w:p>
         </w:tc>
       </w:tr>
       <w:tr>
+        <w:trPr>
+          <w:cantSplit/>
+        </w:trPr>
         <w:tc>
           <w:tcPr>
             <w:tcW w:w="4896" w:type="dxa"/>
@@ -615,6 +608,9 @@
         </w:tc>
       </w:tr>
       <w:tr>
+        <w:trPr>
+          <w:cantSplit/>
+        </w:trPr>
         <w:tc>
           <w:tcPr>
             <w:tcW w:type="dxa" w:w="4896"/>
@@ -631,7 +627,7 @@
           </w:tcPr>
           <w:p>
             <w:r>
-              <w:t>多租户SaaS（云边协同）</w:t>
+              <w:t>核心 MES 试点版（SaaS 后置）</w:t>
             </w:r>
           </w:p>
         </w:tc>
@@ -1202,6 +1198,10 @@
         <w:gridCol w:w="3264"/>
       </w:tblGrid>
       <w:tr>
+        <w:trPr>
+          <w:tblHeader w:val="true"/>
+          <w:cantSplit/>
+        </w:trPr>
         <w:tc>
           <w:tcPr>
             <w:tcW w:w="1440" w:type="dxa"/>
@@ -1321,6 +1321,9 @@
         </w:tc>
       </w:tr>
       <w:tr>
+        <w:trPr>
+          <w:cantSplit/>
+        </w:trPr>
         <w:tc>
           <w:tcPr>
             <w:tcW w:w="3264" w:type="dxa"/>
@@ -1437,6 +1440,9 @@
         </w:tc>
       </w:tr>
       <w:tr>
+        <w:trPr>
+          <w:cantSplit/>
+        </w:trPr>
         <w:tc>
           <w:tcPr>
             <w:tcW w:w="3264" w:type="dxa"/>
@@ -1553,6 +1559,9 @@
         </w:tc>
       </w:tr>
       <w:tr>
+        <w:trPr>
+          <w:cantSplit/>
+        </w:trPr>
         <w:tc>
           <w:tcPr>
             <w:tcW w:w="3264" w:type="dxa"/>
@@ -1669,6 +1678,9 @@
         </w:tc>
       </w:tr>
       <w:tr>
+        <w:trPr>
+          <w:cantSplit/>
+        </w:trPr>
         <w:tc>
           <w:tcPr>
             <w:tcW w:w="3264" w:type="dxa"/>
@@ -1830,6 +1842,10 @@
         <w:gridCol w:w="3264"/>
       </w:tblGrid>
       <w:tr>
+        <w:trPr>
+          <w:tblHeader w:val="true"/>
+          <w:cantSplit/>
+        </w:trPr>
         <w:tc>
           <w:tcPr>
             <w:tcW w:w="1440" w:type="dxa"/>
@@ -1949,6 +1965,9 @@
         </w:tc>
       </w:tr>
       <w:tr>
+        <w:trPr>
+          <w:cantSplit/>
+        </w:trPr>
         <w:tc>
           <w:tcPr>
             <w:tcW w:w="3264" w:type="dxa"/>
@@ -2065,6 +2084,9 @@
         </w:tc>
       </w:tr>
       <w:tr>
+        <w:trPr>
+          <w:cantSplit/>
+        </w:trPr>
         <w:tc>
           <w:tcPr>
             <w:tcW w:w="3264" w:type="dxa"/>
@@ -2181,6 +2203,9 @@
         </w:tc>
       </w:tr>
       <w:tr>
+        <w:trPr>
+          <w:cantSplit/>
+        </w:trPr>
         <w:tc>
           <w:tcPr>
             <w:tcW w:w="3264" w:type="dxa"/>
@@ -2297,6 +2322,9 @@
         </w:tc>
       </w:tr>
       <w:tr>
+        <w:trPr>
+          <w:cantSplit/>
+        </w:trPr>
         <w:tc>
           <w:tcPr>
             <w:tcW w:w="3264" w:type="dxa"/>
@@ -2413,6 +2441,9 @@
         </w:tc>
       </w:tr>
       <w:tr>
+        <w:trPr>
+          <w:cantSplit/>
+        </w:trPr>
         <w:tc>
           <w:tcPr>
             <w:tcW w:w="3264" w:type="dxa"/>
@@ -2647,6 +2678,10 @@
         <w:gridCol w:w="2448"/>
       </w:tblGrid>
       <w:tr>
+        <w:trPr>
+          <w:tblHeader w:val="true"/>
+          <w:cantSplit/>
+        </w:trPr>
         <w:tc>
           <w:tcPr>
             <w:tcW w:w="1440" w:type="dxa"/>
@@ -2805,6 +2840,9 @@
         </w:tc>
       </w:tr>
       <w:tr>
+        <w:trPr>
+          <w:cantSplit/>
+        </w:trPr>
         <w:tc>
           <w:tcPr>
             <w:tcW w:w="2448" w:type="dxa"/>
@@ -2959,6 +2997,9 @@
         </w:tc>
       </w:tr>
       <w:tr>
+        <w:trPr>
+          <w:cantSplit/>
+        </w:trPr>
         <w:tc>
           <w:tcPr>
             <w:tcW w:w="2448" w:type="dxa"/>
@@ -3113,6 +3154,9 @@
         </w:tc>
       </w:tr>
       <w:tr>
+        <w:trPr>
+          <w:cantSplit/>
+        </w:trPr>
         <w:tc>
           <w:tcPr>
             <w:tcW w:w="2448" w:type="dxa"/>
@@ -3267,6 +3311,9 @@
         </w:tc>
       </w:tr>
       <w:tr>
+        <w:trPr>
+          <w:cantSplit/>
+        </w:trPr>
         <w:tc>
           <w:tcPr>
             <w:tcW w:w="2448" w:type="dxa"/>
@@ -3421,6 +3468,9 @@
         </w:tc>
       </w:tr>
       <w:tr>
+        <w:trPr>
+          <w:cantSplit/>
+        </w:trPr>
         <w:tc>
           <w:tcPr>
             <w:tcW w:w="2448" w:type="dxa"/>
@@ -3575,6 +3625,9 @@
         </w:tc>
       </w:tr>
       <w:tr>
+        <w:trPr>
+          <w:cantSplit/>
+        </w:trPr>
         <w:tc>
           <w:tcPr>
             <w:tcW w:w="2448" w:type="dxa"/>
@@ -3729,6 +3782,9 @@
         </w:tc>
       </w:tr>
       <w:tr>
+        <w:trPr>
+          <w:cantSplit/>
+        </w:trPr>
         <w:tc>
           <w:tcPr>
             <w:tcW w:w="2448" w:type="dxa"/>
@@ -3883,6 +3939,9 @@
         </w:tc>
       </w:tr>
       <w:tr>
+        <w:trPr>
+          <w:cantSplit/>
+        </w:trPr>
         <w:tc>
           <w:tcPr>
             <w:tcW w:w="2448" w:type="dxa"/>
@@ -4081,6 +4140,10 @@
         <w:gridCol w:w="4896"/>
       </w:tblGrid>
       <w:tr>
+        <w:trPr>
+          <w:tblHeader w:val="true"/>
+          <w:cantSplit/>
+        </w:trPr>
         <w:tc>
           <w:tcPr>
             <w:tcW w:w="1728" w:type="dxa"/>
@@ -4161,6 +4224,9 @@
         </w:tc>
       </w:tr>
       <w:tr>
+        <w:trPr>
+          <w:cantSplit/>
+        </w:trPr>
         <w:tc>
           <w:tcPr>
             <w:tcW w:w="4896" w:type="dxa"/>
@@ -4239,6 +4305,9 @@
         </w:tc>
       </w:tr>
       <w:tr>
+        <w:trPr>
+          <w:cantSplit/>
+        </w:trPr>
         <w:tc>
           <w:tcPr>
             <w:tcW w:w="4896" w:type="dxa"/>
@@ -4317,6 +4386,9 @@
         </w:tc>
       </w:tr>
       <w:tr>
+        <w:trPr>
+          <w:cantSplit/>
+        </w:trPr>
         <w:tc>
           <w:tcPr>
             <w:tcW w:w="4896" w:type="dxa"/>
@@ -4395,6 +4467,9 @@
         </w:tc>
       </w:tr>
       <w:tr>
+        <w:trPr>
+          <w:cantSplit/>
+        </w:trPr>
         <w:tc>
           <w:tcPr>
             <w:tcW w:w="4896" w:type="dxa"/>
@@ -4473,6 +4548,9 @@
         </w:tc>
       </w:tr>
       <w:tr>
+        <w:trPr>
+          <w:cantSplit/>
+        </w:trPr>
         <w:tc>
           <w:tcPr>
             <w:tcW w:w="4896" w:type="dxa"/>
@@ -4551,6 +4629,9 @@
         </w:tc>
       </w:tr>
       <w:tr>
+        <w:trPr>
+          <w:cantSplit/>
+        </w:trPr>
         <w:tc>
           <w:tcPr>
             <w:tcW w:w="4896" w:type="dxa"/>
@@ -4792,6 +4873,10 @@
         <w:gridCol w:w="3264"/>
       </w:tblGrid>
       <w:tr>
+        <w:trPr>
+          <w:tblHeader w:val="true"/>
+          <w:cantSplit/>
+        </w:trPr>
         <w:tc>
           <w:tcPr>
             <w:tcW w:w="1800" w:type="dxa"/>
@@ -4911,6 +4996,9 @@
         </w:tc>
       </w:tr>
       <w:tr>
+        <w:trPr>
+          <w:cantSplit/>
+        </w:trPr>
         <w:tc>
           <w:tcPr>
             <w:tcW w:w="3264" w:type="dxa"/>
@@ -5027,6 +5115,9 @@
         </w:tc>
       </w:tr>
       <w:tr>
+        <w:trPr>
+          <w:cantSplit/>
+        </w:trPr>
         <w:tc>
           <w:tcPr>
             <w:tcW w:w="3264" w:type="dxa"/>
@@ -5143,6 +5234,9 @@
         </w:tc>
       </w:tr>
       <w:tr>
+        <w:trPr>
+          <w:cantSplit/>
+        </w:trPr>
         <w:tc>
           <w:tcPr>
             <w:tcW w:w="3264" w:type="dxa"/>
@@ -5259,6 +5353,9 @@
         </w:tc>
       </w:tr>
       <w:tr>
+        <w:trPr>
+          <w:cantSplit/>
+        </w:trPr>
         <w:tc>
           <w:tcPr>
             <w:tcW w:w="3264" w:type="dxa"/>
@@ -5375,6 +5472,9 @@
         </w:tc>
       </w:tr>
       <w:tr>
+        <w:trPr>
+          <w:cantSplit/>
+        </w:trPr>
         <w:tc>
           <w:tcPr>
             <w:tcW w:w="3264" w:type="dxa"/>
@@ -5536,6 +5636,10 @@
         <w:gridCol w:w="3264"/>
       </w:tblGrid>
       <w:tr>
+        <w:trPr>
+          <w:tblHeader w:val="true"/>
+          <w:cantSplit/>
+        </w:trPr>
         <w:tc>
           <w:tcPr>
             <w:tcW w:w="1800" w:type="dxa"/>
@@ -5655,6 +5759,9 @@
         </w:tc>
       </w:tr>
       <w:tr>
+        <w:trPr>
+          <w:cantSplit/>
+        </w:trPr>
         <w:tc>
           <w:tcPr>
             <w:tcW w:w="3264" w:type="dxa"/>
@@ -5771,6 +5878,9 @@
         </w:tc>
       </w:tr>
       <w:tr>
+        <w:trPr>
+          <w:cantSplit/>
+        </w:trPr>
         <w:tc>
           <w:tcPr>
             <w:tcW w:w="3264" w:type="dxa"/>
@@ -5887,6 +5997,9 @@
         </w:tc>
       </w:tr>
       <w:tr>
+        <w:trPr>
+          <w:cantSplit/>
+        </w:trPr>
         <w:tc>
           <w:tcPr>
             <w:tcW w:w="3264" w:type="dxa"/>
@@ -6003,6 +6116,9 @@
         </w:tc>
       </w:tr>
       <w:tr>
+        <w:trPr>
+          <w:cantSplit/>
+        </w:trPr>
         <w:tc>
           <w:tcPr>
             <w:tcW w:w="3264" w:type="dxa"/>
@@ -6119,6 +6235,9 @@
         </w:tc>
       </w:tr>
       <w:tr>
+        <w:trPr>
+          <w:cantSplit/>
+        </w:trPr>
         <w:tc>
           <w:tcPr>
             <w:tcW w:w="3264" w:type="dxa"/>
@@ -6235,6 +6354,9 @@
         </w:tc>
       </w:tr>
       <w:tr>
+        <w:trPr>
+          <w:cantSplit/>
+        </w:trPr>
         <w:tc>
           <w:tcPr>
             <w:tcW w:w="3264" w:type="dxa"/>
@@ -6603,6 +6725,10 @@
         <w:gridCol w:w="2448"/>
       </w:tblGrid>
       <w:tr>
+        <w:trPr>
+          <w:tblHeader w:val="true"/>
+          <w:cantSplit/>
+        </w:trPr>
         <w:tc>
           <w:tcPr>
             <w:tcW w:w="1152" w:type="dxa"/>
@@ -6761,6 +6887,9 @@
         </w:tc>
       </w:tr>
       <w:tr>
+        <w:trPr>
+          <w:cantSplit/>
+        </w:trPr>
         <w:tc>
           <w:tcPr>
             <w:tcW w:w="2448" w:type="dxa"/>
@@ -6915,6 +7044,9 @@
         </w:tc>
       </w:tr>
       <w:tr>
+        <w:trPr>
+          <w:cantSplit/>
+        </w:trPr>
         <w:tc>
           <w:tcPr>
             <w:tcW w:w="2448" w:type="dxa"/>
@@ -7069,6 +7201,9 @@
         </w:tc>
       </w:tr>
       <w:tr>
+        <w:trPr>
+          <w:cantSplit/>
+        </w:trPr>
         <w:tc>
           <w:tcPr>
             <w:tcW w:w="2448" w:type="dxa"/>
@@ -7223,6 +7358,9 @@
         </w:tc>
       </w:tr>
       <w:tr>
+        <w:trPr>
+          <w:cantSplit/>
+        </w:trPr>
         <w:tc>
           <w:tcPr>
             <w:tcW w:w="2448" w:type="dxa"/>
@@ -7377,6 +7515,9 @@
         </w:tc>
       </w:tr>
       <w:tr>
+        <w:trPr>
+          <w:cantSplit/>
+        </w:trPr>
         <w:tc>
           <w:tcPr>
             <w:tcW w:w="2448" w:type="dxa"/>
@@ -7531,6 +7672,9 @@
         </w:tc>
       </w:tr>
       <w:tr>
+        <w:trPr>
+          <w:cantSplit/>
+        </w:trPr>
         <w:tc>
           <w:tcPr>
             <w:tcW w:w="2448" w:type="dxa"/>
@@ -7685,6 +7829,9 @@
         </w:tc>
       </w:tr>
       <w:tr>
+        <w:trPr>
+          <w:cantSplit/>
+        </w:trPr>
         <w:tc>
           <w:tcPr>
             <w:tcW w:w="2448" w:type="dxa"/>
@@ -7956,6 +8103,10 @@
         <w:gridCol w:w="3264"/>
       </w:tblGrid>
       <w:tr>
+        <w:trPr>
+          <w:tblHeader w:val="true"/>
+          <w:cantSplit/>
+        </w:trPr>
         <w:tc>
           <w:tcPr>
             <w:tcW w:w="1656" w:type="dxa"/>
@@ -8075,6 +8226,9 @@
         </w:tc>
       </w:tr>
       <w:tr>
+        <w:trPr>
+          <w:cantSplit/>
+        </w:trPr>
         <w:tc>
           <w:tcPr>
             <w:tcW w:w="3264" w:type="dxa"/>
@@ -8191,6 +8345,9 @@
         </w:tc>
       </w:tr>
       <w:tr>
+        <w:trPr>
+          <w:cantSplit/>
+        </w:trPr>
         <w:tc>
           <w:tcPr>
             <w:tcW w:w="3264" w:type="dxa"/>
@@ -8307,6 +8464,9 @@
         </w:tc>
       </w:tr>
       <w:tr>
+        <w:trPr>
+          <w:cantSplit/>
+        </w:trPr>
         <w:tc>
           <w:tcPr>
             <w:tcW w:w="3264" w:type="dxa"/>
@@ -8423,6 +8583,9 @@
         </w:tc>
       </w:tr>
       <w:tr>
+        <w:trPr>
+          <w:cantSplit/>
+        </w:trPr>
         <w:tc>
           <w:tcPr>
             <w:tcW w:w="3264" w:type="dxa"/>
@@ -8539,6 +8702,9 @@
         </w:tc>
       </w:tr>
       <w:tr>
+        <w:trPr>
+          <w:cantSplit/>
+        </w:trPr>
         <w:tc>
           <w:tcPr>
             <w:tcW w:w="3264" w:type="dxa"/>
@@ -8655,6 +8821,9 @@
         </w:tc>
       </w:tr>
       <w:tr>
+        <w:trPr>
+          <w:cantSplit/>
+        </w:trPr>
         <w:tc>
           <w:tcPr>
             <w:tcW w:w="3264" w:type="dxa"/>
@@ -8771,6 +8940,9 @@
         </w:tc>
       </w:tr>
       <w:tr>
+        <w:trPr>
+          <w:cantSplit/>
+        </w:trPr>
         <w:tc>
           <w:tcPr>
             <w:tcW w:w="3264" w:type="dxa"/>
@@ -9361,6 +9533,10 @@
         <w:gridCol w:w="4896"/>
       </w:tblGrid>
       <w:tr>
+        <w:trPr>
+          <w:tblHeader w:val="true"/>
+          <w:cantSplit/>
+        </w:trPr>
         <w:tc>
           <w:tcPr>
             <w:tcW w:w="1584" w:type="dxa"/>
@@ -9441,6 +9617,9 @@
         </w:tc>
       </w:tr>
       <w:tr>
+        <w:trPr>
+          <w:cantSplit/>
+        </w:trPr>
         <w:tc>
           <w:tcPr>
             <w:tcW w:w="4896" w:type="dxa"/>
@@ -9519,6 +9698,9 @@
         </w:tc>
       </w:tr>
       <w:tr>
+        <w:trPr>
+          <w:cantSplit/>
+        </w:trPr>
         <w:tc>
           <w:tcPr>
             <w:tcW w:w="4896" w:type="dxa"/>
@@ -9597,6 +9779,9 @@
         </w:tc>
       </w:tr>
       <w:tr>
+        <w:trPr>
+          <w:cantSplit/>
+        </w:trPr>
         <w:tc>
           <w:tcPr>
             <w:tcW w:w="4896" w:type="dxa"/>
@@ -9675,6 +9860,9 @@
         </w:tc>
       </w:tr>
       <w:tr>
+        <w:trPr>
+          <w:cantSplit/>
+        </w:trPr>
         <w:tc>
           <w:tcPr>
             <w:tcW w:w="4896" w:type="dxa"/>
@@ -9753,6 +9941,9 @@
         </w:tc>
       </w:tr>
       <w:tr>
+        <w:trPr>
+          <w:cantSplit/>
+        </w:trPr>
         <w:tc>
           <w:tcPr>
             <w:tcW w:w="4896" w:type="dxa"/>
@@ -9911,6 +10102,10 @@
         <w:gridCol w:w="4896"/>
       </w:tblGrid>
       <w:tr>
+        <w:trPr>
+          <w:tblHeader w:val="true"/>
+          <w:cantSplit/>
+        </w:trPr>
         <w:tc>
           <w:tcPr>
             <w:tcW w:w="2160" w:type="dxa"/>
@@ -9991,6 +10186,9 @@
         </w:tc>
       </w:tr>
       <w:tr>
+        <w:trPr>
+          <w:cantSplit/>
+        </w:trPr>
         <w:tc>
           <w:tcPr>
             <w:tcW w:w="4896" w:type="dxa"/>
@@ -10069,6 +10267,9 @@
         </w:tc>
       </w:tr>
       <w:tr>
+        <w:trPr>
+          <w:cantSplit/>
+        </w:trPr>
         <w:tc>
           <w:tcPr>
             <w:tcW w:w="4896" w:type="dxa"/>
@@ -10147,6 +10348,9 @@
         </w:tc>
       </w:tr>
       <w:tr>
+        <w:trPr>
+          <w:cantSplit/>
+        </w:trPr>
         <w:tc>
           <w:tcPr>
             <w:tcW w:w="4896" w:type="dxa"/>
@@ -10225,6 +10429,9 @@
         </w:tc>
       </w:tr>
       <w:tr>
+        <w:trPr>
+          <w:cantSplit/>
+        </w:trPr>
         <w:tc>
           <w:tcPr>
             <w:tcW w:w="4896" w:type="dxa"/>
@@ -10303,6 +10510,9 @@
         </w:tc>
       </w:tr>
       <w:tr>
+        <w:trPr>
+          <w:cantSplit/>
+        </w:trPr>
         <w:tc>
           <w:tcPr>
             <w:tcW w:w="4896" w:type="dxa"/>
@@ -10707,6 +10917,10 @@
         <w:gridCol w:w="3264"/>
       </w:tblGrid>
       <w:tr>
+        <w:trPr>
+          <w:tblHeader w:val="true"/>
+          <w:cantSplit/>
+        </w:trPr>
         <w:tc>
           <w:tcPr>
             <w:tcW w:w="1800" w:type="dxa"/>
@@ -10826,6 +11040,9 @@
         </w:tc>
       </w:tr>
       <w:tr>
+        <w:trPr>
+          <w:cantSplit/>
+        </w:trPr>
         <w:tc>
           <w:tcPr>
             <w:tcW w:w="3264" w:type="dxa"/>
@@ -10942,6 +11159,9 @@
         </w:tc>
       </w:tr>
       <w:tr>
+        <w:trPr>
+          <w:cantSplit/>
+        </w:trPr>
         <w:tc>
           <w:tcPr>
             <w:tcW w:w="3264" w:type="dxa"/>
@@ -11058,6 +11278,9 @@
         </w:tc>
       </w:tr>
       <w:tr>
+        <w:trPr>
+          <w:cantSplit/>
+        </w:trPr>
         <w:tc>
           <w:tcPr>
             <w:tcW w:w="3264" w:type="dxa"/>
@@ -11174,6 +11397,9 @@
         </w:tc>
       </w:tr>
       <w:tr>
+        <w:trPr>
+          <w:cantSplit/>
+        </w:trPr>
         <w:tc>
           <w:tcPr>
             <w:tcW w:w="3264" w:type="dxa"/>
@@ -11290,6 +11516,9 @@
         </w:tc>
       </w:tr>
       <w:tr>
+        <w:trPr>
+          <w:cantSplit/>
+        </w:trPr>
         <w:tc>
           <w:tcPr>
             <w:tcW w:w="3264" w:type="dxa"/>
@@ -11406,6 +11635,9 @@
         </w:tc>
       </w:tr>
       <w:tr>
+        <w:trPr>
+          <w:cantSplit/>
+        </w:trPr>
         <w:tc>
           <w:tcPr>
             <w:tcW w:w="3264" w:type="dxa"/>
@@ -11567,6 +11799,10 @@
         <w:gridCol w:w="3264"/>
       </w:tblGrid>
       <w:tr>
+        <w:trPr>
+          <w:tblHeader w:val="true"/>
+          <w:cantSplit/>
+        </w:trPr>
         <w:tc>
           <w:tcPr>
             <w:tcW w:w="2232" w:type="dxa"/>
@@ -11686,6 +11922,9 @@
         </w:tc>
       </w:tr>
       <w:tr>
+        <w:trPr>
+          <w:cantSplit/>
+        </w:trPr>
         <w:tc>
           <w:tcPr>
             <w:tcW w:w="3264" w:type="dxa"/>
@@ -11802,6 +12041,9 @@
         </w:tc>
       </w:tr>
       <w:tr>
+        <w:trPr>
+          <w:cantSplit/>
+        </w:trPr>
         <w:tc>
           <w:tcPr>
             <w:tcW w:w="3264" w:type="dxa"/>
@@ -11918,6 +12160,9 @@
         </w:tc>
       </w:tr>
       <w:tr>
+        <w:trPr>
+          <w:cantSplit/>
+        </w:trPr>
         <w:tc>
           <w:tcPr>
             <w:tcW w:w="3264" w:type="dxa"/>
@@ -12034,6 +12279,9 @@
         </w:tc>
       </w:tr>
       <w:tr>
+        <w:trPr>
+          <w:cantSplit/>
+        </w:trPr>
         <w:tc>
           <w:tcPr>
             <w:tcW w:w="3264" w:type="dxa"/>
@@ -12150,6 +12398,9 @@
         </w:tc>
       </w:tr>
       <w:tr>
+        <w:trPr>
+          <w:cantSplit/>
+        </w:trPr>
         <w:tc>
           <w:tcPr>
             <w:tcW w:w="3264" w:type="dxa"/>
@@ -12266,6 +12517,9 @@
         </w:tc>
       </w:tr>
       <w:tr>
+        <w:trPr>
+          <w:cantSplit/>
+        </w:trPr>
         <w:tc>
           <w:tcPr>
             <w:tcW w:w="3264" w:type="dxa"/>
@@ -12382,6 +12636,9 @@
         </w:tc>
       </w:tr>
       <w:tr>
+        <w:trPr>
+          <w:cantSplit/>
+        </w:trPr>
         <w:tc>
           <w:tcPr>
             <w:tcW w:w="3264" w:type="dxa"/>
@@ -12561,6 +12818,10 @@
         <w:gridCol w:w="3264"/>
       </w:tblGrid>
       <w:tr>
+        <w:trPr>
+          <w:tblHeader w:val="true"/>
+          <w:cantSplit/>
+        </w:trPr>
         <w:tc>
           <w:tcPr>
             <w:tcW w:w="1944" w:type="dxa"/>
@@ -12680,6 +12941,9 @@
         </w:tc>
       </w:tr>
       <w:tr>
+        <w:trPr>
+          <w:cantSplit/>
+        </w:trPr>
         <w:tc>
           <w:tcPr>
             <w:tcW w:w="3264" w:type="dxa"/>
@@ -12796,6 +13060,9 @@
         </w:tc>
       </w:tr>
       <w:tr>
+        <w:trPr>
+          <w:cantSplit/>
+        </w:trPr>
         <w:tc>
           <w:tcPr>
             <w:tcW w:w="3264" w:type="dxa"/>
@@ -12912,6 +13179,9 @@
         </w:tc>
       </w:tr>
       <w:tr>
+        <w:trPr>
+          <w:cantSplit/>
+        </w:trPr>
         <w:tc>
           <w:tcPr>
             <w:tcW w:w="3264" w:type="dxa"/>
@@ -13028,6 +13298,9 @@
         </w:tc>
       </w:tr>
       <w:tr>
+        <w:trPr>
+          <w:cantSplit/>
+        </w:trPr>
         <w:tc>
           <w:tcPr>
             <w:tcW w:w="3264" w:type="dxa"/>
@@ -13144,6 +13417,9 @@
         </w:tc>
       </w:tr>
       <w:tr>
+        <w:trPr>
+          <w:cantSplit/>
+        </w:trPr>
         <w:tc>
           <w:tcPr>
             <w:tcW w:w="3264" w:type="dxa"/>
@@ -13260,6 +13536,9 @@
         </w:tc>
       </w:tr>
       <w:tr>
+        <w:trPr>
+          <w:cantSplit/>
+        </w:trPr>
         <w:tc>
           <w:tcPr>
             <w:tcW w:w="3264" w:type="dxa"/>
@@ -13376,6 +13655,9 @@
         </w:tc>
       </w:tr>
       <w:tr>
+        <w:trPr>
+          <w:cantSplit/>
+        </w:trPr>
         <w:tc>
           <w:tcPr>
             <w:tcW w:w="3264" w:type="dxa"/>
@@ -13554,6 +13836,10 @@
         <w:gridCol w:w="4896"/>
       </w:tblGrid>
       <w:tr>
+        <w:trPr>
+          <w:tblHeader w:val="true"/>
+          <w:cantSplit/>
+        </w:trPr>
         <w:tc>
           <w:tcPr>
             <w:tcW w:w="2304" w:type="dxa"/>
@@ -13634,6 +13920,9 @@
         </w:tc>
       </w:tr>
       <w:tr>
+        <w:trPr>
+          <w:cantSplit/>
+        </w:trPr>
         <w:tc>
           <w:tcPr>
             <w:tcW w:w="4896" w:type="dxa"/>
@@ -13712,6 +14001,9 @@
         </w:tc>
       </w:tr>
       <w:tr>
+        <w:trPr>
+          <w:cantSplit/>
+        </w:trPr>
         <w:tc>
           <w:tcPr>
             <w:tcW w:w="4896" w:type="dxa"/>
@@ -13790,6 +14082,9 @@
         </w:tc>
       </w:tr>
       <w:tr>
+        <w:trPr>
+          <w:cantSplit/>
+        </w:trPr>
         <w:tc>
           <w:tcPr>
             <w:tcW w:w="4896" w:type="dxa"/>
@@ -13868,6 +14163,9 @@
         </w:tc>
       </w:tr>
       <w:tr>
+        <w:trPr>
+          <w:cantSplit/>
+        </w:trPr>
         <w:tc>
           <w:tcPr>
             <w:tcW w:w="4896" w:type="dxa"/>
@@ -13946,6 +14244,9 @@
         </w:tc>
       </w:tr>
       <w:tr>
+        <w:trPr>
+          <w:cantSplit/>
+        </w:trPr>
         <w:tc>
           <w:tcPr>
             <w:tcW w:w="4896" w:type="dxa"/>
@@ -14024,6 +14325,9 @@
         </w:tc>
       </w:tr>
       <w:tr>
+        <w:trPr>
+          <w:cantSplit/>
+        </w:trPr>
         <w:tc>
           <w:tcPr>
             <w:tcW w:w="4896" w:type="dxa"/>
@@ -14354,6 +14658,10 @@
         <w:gridCol w:w="3264"/>
       </w:tblGrid>
       <w:tr>
+        <w:trPr>
+          <w:tblHeader w:val="true"/>
+          <w:cantSplit/>
+        </w:trPr>
         <w:tc>
           <w:tcPr>
             <w:tcW w:w="1800" w:type="dxa"/>
@@ -14473,6 +14781,9 @@
         </w:tc>
       </w:tr>
       <w:tr>
+        <w:trPr>
+          <w:cantSplit/>
+        </w:trPr>
         <w:tc>
           <w:tcPr>
             <w:tcW w:w="3264" w:type="dxa"/>
@@ -14589,6 +14900,9 @@
         </w:tc>
       </w:tr>
       <w:tr>
+        <w:trPr>
+          <w:cantSplit/>
+        </w:trPr>
         <w:tc>
           <w:tcPr>
             <w:tcW w:w="3264" w:type="dxa"/>
@@ -14705,6 +15019,9 @@
         </w:tc>
       </w:tr>
       <w:tr>
+        <w:trPr>
+          <w:cantSplit/>
+        </w:trPr>
         <w:tc>
           <w:tcPr>
             <w:tcW w:w="3264" w:type="dxa"/>
@@ -14821,6 +15138,9 @@
         </w:tc>
       </w:tr>
       <w:tr>
+        <w:trPr>
+          <w:cantSplit/>
+        </w:trPr>
         <w:tc>
           <w:tcPr>
             <w:tcW w:w="3264" w:type="dxa"/>
@@ -14937,6 +15257,9 @@
         </w:tc>
       </w:tr>
       <w:tr>
+        <w:trPr>
+          <w:cantSplit/>
+        </w:trPr>
         <w:tc>
           <w:tcPr>
             <w:tcW w:w="3264" w:type="dxa"/>
@@ -15053,6 +15376,9 @@
         </w:tc>
       </w:tr>
       <w:tr>
+        <w:trPr>
+          <w:cantSplit/>
+        </w:trPr>
         <w:tc>
           <w:tcPr>
             <w:tcW w:w="3264" w:type="dxa"/>
@@ -15213,6 +15539,10 @@
         <w:gridCol w:w="4896"/>
       </w:tblGrid>
       <w:tr>
+        <w:trPr>
+          <w:tblHeader w:val="true"/>
+          <w:cantSplit/>
+        </w:trPr>
         <w:tc>
           <w:tcPr>
             <w:tcW w:w="4608" w:type="dxa"/>
@@ -15293,6 +15623,9 @@
         </w:tc>
       </w:tr>
       <w:tr>
+        <w:trPr>
+          <w:cantSplit/>
+        </w:trPr>
         <w:tc>
           <w:tcPr>
             <w:tcW w:w="4896" w:type="dxa"/>
@@ -15371,6 +15704,9 @@
         </w:tc>
       </w:tr>
       <w:tr>
+        <w:trPr>
+          <w:cantSplit/>
+        </w:trPr>
         <w:tc>
           <w:tcPr>
             <w:tcW w:w="4896" w:type="dxa"/>
@@ -15449,6 +15785,9 @@
         </w:tc>
       </w:tr>
       <w:tr>
+        <w:trPr>
+          <w:cantSplit/>
+        </w:trPr>
         <w:tc>
           <w:tcPr>
             <w:tcW w:w="4896" w:type="dxa"/>
@@ -15527,6 +15866,9 @@
         </w:tc>
       </w:tr>
       <w:tr>
+        <w:trPr>
+          <w:cantSplit/>
+        </w:trPr>
         <w:tc>
           <w:tcPr>
             <w:tcW w:w="4896" w:type="dxa"/>
@@ -15605,6 +15947,9 @@
         </w:tc>
       </w:tr>
       <w:tr>
+        <w:trPr>
+          <w:cantSplit/>
+        </w:trPr>
         <w:tc>
           <w:tcPr>
             <w:tcW w:w="4896" w:type="dxa"/>
@@ -15683,6 +16028,9 @@
         </w:tc>
       </w:tr>
       <w:tr>
+        <w:trPr>
+          <w:cantSplit/>
+        </w:trPr>
         <w:tc>
           <w:tcPr>
             <w:tcW w:w="4896" w:type="dxa"/>
@@ -15761,6 +16109,9 @@
         </w:tc>
       </w:tr>
       <w:tr>
+        <w:trPr>
+          <w:cantSplit/>
+        </w:trPr>
         <w:tc>
           <w:tcPr>
             <w:tcW w:w="4896" w:type="dxa"/>
@@ -15884,6 +16235,10 @@
         <w:gridCol w:w="3264"/>
       </w:tblGrid>
       <w:tr>
+        <w:trPr>
+          <w:tblHeader w:val="true"/>
+          <w:cantSplit/>
+        </w:trPr>
         <w:tc>
           <w:tcPr>
             <w:tcW w:w="1800" w:type="dxa"/>
@@ -16003,6 +16358,9 @@
         </w:tc>
       </w:tr>
       <w:tr>
+        <w:trPr>
+          <w:cantSplit/>
+        </w:trPr>
         <w:tc>
           <w:tcPr>
             <w:tcW w:w="3264" w:type="dxa"/>
@@ -16119,6 +16477,9 @@
         </w:tc>
       </w:tr>
       <w:tr>
+        <w:trPr>
+          <w:cantSplit/>
+        </w:trPr>
         <w:tc>
           <w:tcPr>
             <w:tcW w:w="3264" w:type="dxa"/>
@@ -16235,6 +16596,9 @@
         </w:tc>
       </w:tr>
       <w:tr>
+        <w:trPr>
+          <w:cantSplit/>
+        </w:trPr>
         <w:tc>
           <w:tcPr>
             <w:tcW w:w="3264" w:type="dxa"/>
@@ -16351,6 +16715,9 @@
         </w:tc>
       </w:tr>
       <w:tr>
+        <w:trPr>
+          <w:cantSplit/>
+        </w:trPr>
         <w:tc>
           <w:tcPr>
             <w:tcW w:w="3264" w:type="dxa"/>
@@ -16467,6 +16834,9 @@
         </w:tc>
       </w:tr>
       <w:tr>
+        <w:trPr>
+          <w:cantSplit/>
+        </w:trPr>
         <w:tc>
           <w:tcPr>
             <w:tcW w:w="3264" w:type="dxa"/>
@@ -16583,6 +16953,9 @@
         </w:tc>
       </w:tr>
       <w:tr>
+        <w:trPr>
+          <w:cantSplit/>
+        </w:trPr>
         <w:tc>
           <w:tcPr>
             <w:tcW w:w="3264" w:type="dxa"/>
@@ -16797,12 +17170,7 @@
         <w:spacing w:after="120" w:line="276" w:lineRule="auto"/>
       </w:pPr>
       <w:r>
-        <w:rPr>
-          <w:rFonts w:ascii="HYZhongHeiKW" w:hAnsi="HYZhongHeiKW" w:eastAsia="HYZhongHeiKW"/>
-          <w:b w:val="0"/>
-          <w:sz w:val="21"/>
-        </w:rPr>
-        <w:t>本项目最终以多租户SaaS形式交付，采用“云端控制平面 + 企业租户空间 + 工厂边缘网关”的云边协同模式。SaaS平台负责业务、分析、智能体和策略编排，边缘网关负责设备接入、本地缓存和必要的现场规则。</w:t>
+        <w:t>SaaS作为远期交付方向保留，本阶段不纳入开发验收。当前优先完成可独立运行的核心MES、四条产线仿真、故障闭环、生产执行、数字孪生和策略仿真；待单工厂试点稳定后，再评估多租户、计费和云边协同。</w:t>
       </w:r>
     </w:p>
     <w:p>
@@ -16878,6 +17246,10 @@
         <w:gridCol w:w="4896"/>
       </w:tblGrid>
       <w:tr>
+        <w:trPr>
+          <w:tblHeader w:val="true"/>
+          <w:cantSplit/>
+        </w:trPr>
         <w:tc>
           <w:tcPr>
             <w:tcW w:type="dxa" w:w="4896"/>
@@ -16912,6 +17284,9 @@
         </w:tc>
       </w:tr>
       <w:tr>
+        <w:trPr>
+          <w:cantSplit/>
+        </w:trPr>
         <w:tc>
           <w:tcPr>
             <w:tcW w:type="dxa" w:w="4896"/>
@@ -16942,6 +17317,9 @@
         </w:tc>
       </w:tr>
       <w:tr>
+        <w:trPr>
+          <w:cantSplit/>
+        </w:trPr>
         <w:tc>
           <w:tcPr>
             <w:tcW w:type="dxa" w:w="4896"/>
@@ -16972,6 +17350,9 @@
         </w:tc>
       </w:tr>
       <w:tr>
+        <w:trPr>
+          <w:cantSplit/>
+        </w:trPr>
         <w:tc>
           <w:tcPr>
             <w:tcW w:type="dxa" w:w="4896"/>
@@ -17002,6 +17383,9 @@
         </w:tc>
       </w:tr>
       <w:tr>
+        <w:trPr>
+          <w:cantSplit/>
+        </w:trPr>
         <w:tc>
           <w:tcPr>
             <w:tcW w:type="dxa" w:w="4896"/>
@@ -17032,6 +17416,9 @@
         </w:tc>
       </w:tr>
       <w:tr>
+        <w:trPr>
+          <w:cantSplit/>
+        </w:trPr>
         <w:tc>
           <w:tcPr>
             <w:tcW w:type="dxa" w:w="4896"/>
@@ -17062,6 +17449,9 @@
         </w:tc>
       </w:tr>
       <w:tr>
+        <w:trPr>
+          <w:cantSplit/>
+        </w:trPr>
         <w:tc>
           <w:tcPr>
             <w:tcW w:type="dxa" w:w="4896"/>
@@ -17112,6 +17502,10 @@
         <w:gridCol w:w="4896"/>
       </w:tblGrid>
       <w:tr>
+        <w:trPr>
+          <w:tblHeader w:val="true"/>
+          <w:cantSplit/>
+        </w:trPr>
         <w:tc>
           <w:tcPr>
             <w:tcW w:type="dxa" w:w="4896"/>
@@ -17146,6 +17540,9 @@
         </w:tc>
       </w:tr>
       <w:tr>
+        <w:trPr>
+          <w:cantSplit/>
+        </w:trPr>
         <w:tc>
           <w:tcPr>
             <w:tcW w:type="dxa" w:w="4896"/>
@@ -17176,6 +17573,9 @@
         </w:tc>
       </w:tr>
       <w:tr>
+        <w:trPr>
+          <w:cantSplit/>
+        </w:trPr>
         <w:tc>
           <w:tcPr>
             <w:tcW w:type="dxa" w:w="4896"/>
@@ -17206,6 +17606,9 @@
         </w:tc>
       </w:tr>
       <w:tr>
+        <w:trPr>
+          <w:cantSplit/>
+        </w:trPr>
         <w:tc>
           <w:tcPr>
             <w:tcW w:type="dxa" w:w="4896"/>
@@ -17236,6 +17639,9 @@
         </w:tc>
       </w:tr>
       <w:tr>
+        <w:trPr>
+          <w:cantSplit/>
+        </w:trPr>
         <w:tc>
           <w:tcPr>
             <w:tcW w:type="dxa" w:w="4896"/>
@@ -17266,6 +17672,9 @@
         </w:tc>
       </w:tr>
       <w:tr>
+        <w:trPr>
+          <w:cantSplit/>
+        </w:trPr>
         <w:tc>
           <w:tcPr>
             <w:tcW w:type="dxa" w:w="4896"/>
@@ -17379,6 +17788,10 @@
         <w:gridCol w:w="3264"/>
       </w:tblGrid>
       <w:tr>
+        <w:trPr>
+          <w:tblHeader w:val="true"/>
+          <w:cantSplit/>
+        </w:trPr>
         <w:tc>
           <w:tcPr>
             <w:tcW w:type="dxa" w:w="3264"/>
@@ -17429,6 +17842,9 @@
         </w:tc>
       </w:tr>
       <w:tr>
+        <w:trPr>
+          <w:cantSplit/>
+        </w:trPr>
         <w:tc>
           <w:tcPr>
             <w:tcW w:type="dxa" w:w="3264"/>
@@ -17473,6 +17889,9 @@
         </w:tc>
       </w:tr>
       <w:tr>
+        <w:trPr>
+          <w:cantSplit/>
+        </w:trPr>
         <w:tc>
           <w:tcPr>
             <w:tcW w:type="dxa" w:w="3264"/>
@@ -17517,6 +17936,9 @@
         </w:tc>
       </w:tr>
       <w:tr>
+        <w:trPr>
+          <w:cantSplit/>
+        </w:trPr>
         <w:tc>
           <w:tcPr>
             <w:tcW w:type="dxa" w:w="3264"/>
@@ -17561,6 +17983,9 @@
         </w:tc>
       </w:tr>
       <w:tr>
+        <w:trPr>
+          <w:cantSplit/>
+        </w:trPr>
         <w:tc>
           <w:tcPr>
             <w:tcW w:type="dxa" w:w="3264"/>
@@ -17624,6 +18049,1246 @@
           <w:sz w:val="21"/>
         </w:rPr>
         <w:t>由于增加多租户、订阅配额、云边协同、租户隔离、云端运维和商业化运营能力，单人开发周期应按12-18个月完成稳定单车间试点版本进行规划；SaaS商业MVP建议18-24个月，稳定商业平台建议24-36个月。</w:t>
+      </w:r>
+    </w:p>
+    <w:p>
+      <w:r>
+        <w:br w:type="page"/>
+      </w:r>
+    </w:p>
+    <w:p>
+      <w:pPr>
+        <w:pStyle w:val="3"/>
+      </w:pPr>
+      <w:r>
+        <w:t>12. 下阶段全量实施任务</w:t>
+      </w:r>
+    </w:p>
+    <w:p>
+      <w:r>
+        <w:t>本章是当前版本结束后的唯一执行清单。目标是把“可演示候选版本”推进为可重复验证、可恢复、可审计的单工厂试点版本。由赵丞单人全栈开发，按模块分工自检；所有任务必须有代码、测试或运行证据，不以页面静态展示代替功能完成。</w:t>
+      </w:r>
+    </w:p>
+    <w:p>
+      <w:pPr>
+        <w:pStyle w:val="4"/>
+      </w:pPr>
+      <w:r>
+        <w:t>12.1 本阶段边界与完成定义</w:t>
+      </w:r>
+    </w:p>
+    <w:p>
+      <w:pPr>
+        <w:pStyle w:val="16"/>
+      </w:pPr>
+      <w:r>
+        <w:t>范围：一个工厂、一个车间、四条产线；覆盖设备、采集、告警、工单、报工、OEE、图纸/表单、数字孪生和策略仿真。</w:t>
+      </w:r>
+    </w:p>
+    <w:p>
+      <w:pPr>
+        <w:pStyle w:val="16"/>
+      </w:pPr>
+      <w:r>
+        <w:t>交互：厂长端保留少量关键入口；查询以对话为主，控制以明确模式、确认、权限和审计为前提。</w:t>
+      </w:r>
+    </w:p>
+    <w:p>
+      <w:pPr>
+        <w:pStyle w:val="16"/>
+      </w:pPr>
+      <w:r>
+        <w:t>控制：API模式与本地仿真模式可切换；故障注入、恢复、产线增删改必须真实调用后端并反馈结果。</w:t>
+      </w:r>
+    </w:p>
+    <w:p>
+      <w:pPr>
+        <w:pStyle w:val="16"/>
+      </w:pPr>
+      <w:r>
+        <w:t>不纳入：SaaS多租户、计费、真实PLC闭环控制、自动停线、复杂视觉模型训练和复杂排产优化。</w:t>
+      </w:r>
+    </w:p>
+    <w:p>
+      <w:pPr>
+        <w:pStyle w:val="16"/>
+      </w:pPr>
+      <w:r>
+        <w:t>完成定义：关键按钮可操作、前后端契约一致、故障可注入可恢复、服务可重启、数据可回放、测试证据齐全。</w:t>
+      </w:r>
+    </w:p>
+    <w:p>
+      <w:pPr>
+        <w:pStyle w:val="4"/>
+      </w:pPr>
+      <w:r>
+        <w:t>12.2 全量任务分解</w:t>
+      </w:r>
+    </w:p>
+    <w:tbl>
+      <w:tblPr>
+        <w:tblStyle w:val="33"/>
+        <w:tblW w:type="auto" w:w="0"/>
+        <w:jc w:val="center"/>
+        <w:tblLook w:firstColumn="1" w:firstRow="1" w:lastColumn="0" w:lastRow="0" w:noHBand="0" w:noVBand="1" w:val="04A0"/>
+      </w:tblPr>
+      <w:tblGrid>
+        <w:gridCol w:w="1958"/>
+        <w:gridCol w:w="1958"/>
+        <w:gridCol w:w="1958"/>
+        <w:gridCol w:w="1958"/>
+        <w:gridCol w:w="1958"/>
+      </w:tblGrid>
+      <w:tr>
+        <w:trPr>
+          <w:tblHeader w:val="true"/>
+          <w:cantSplit/>
+        </w:trPr>
+        <w:tc>
+          <w:tcPr>
+            <w:tcW w:type="dxa" w:w="1958"/>
+            <w:vAlign w:val="center"/>
+          </w:tcPr>
+          <w:p>
+            <w:r>
+              <w:rPr>
+                <w:b/>
+              </w:rPr>
+              <w:t>序号</w:t>
+            </w:r>
+          </w:p>
+        </w:tc>
+        <w:tc>
+          <w:tcPr>
+            <w:tcW w:type="dxa" w:w="1958"/>
+            <w:vAlign w:val="center"/>
+          </w:tcPr>
+          <w:p>
+            <w:r>
+              <w:rPr>
+                <w:b/>
+              </w:rPr>
+              <w:t>任务域</w:t>
+            </w:r>
+          </w:p>
+        </w:tc>
+        <w:tc>
+          <w:tcPr>
+            <w:tcW w:type="dxa" w:w="1958"/>
+            <w:vAlign w:val="center"/>
+          </w:tcPr>
+          <w:p>
+            <w:r>
+              <w:rPr>
+                <w:b/>
+              </w:rPr>
+              <w:t>必须完成的工作</w:t>
+            </w:r>
+          </w:p>
+        </w:tc>
+        <w:tc>
+          <w:tcPr>
+            <w:tcW w:type="dxa" w:w="1958"/>
+            <w:vAlign w:val="center"/>
+          </w:tcPr>
+          <w:p>
+            <w:r>
+              <w:rPr>
+                <w:b/>
+              </w:rPr>
+              <w:t>验收证据</w:t>
+            </w:r>
+          </w:p>
+        </w:tc>
+        <w:tc>
+          <w:tcPr>
+            <w:tcW w:type="dxa" w:w="1958"/>
+            <w:vAlign w:val="center"/>
+          </w:tcPr>
+          <w:p>
+            <w:r>
+              <w:rPr>
+                <w:b/>
+              </w:rPr>
+              <w:t>优先级</w:t>
+            </w:r>
+          </w:p>
+        </w:tc>
+      </w:tr>
+      <w:tr>
+        <w:trPr>
+          <w:cantSplit/>
+        </w:trPr>
+        <w:tc>
+          <w:tcPr>
+            <w:tcW w:type="dxa" w:w="1958"/>
+            <w:vAlign w:val="top"/>
+          </w:tcPr>
+          <w:p>
+            <w:r>
+              <w:t>1</w:t>
+            </w:r>
+          </w:p>
+        </w:tc>
+        <w:tc>
+          <w:tcPr>
+            <w:tcW w:type="dxa" w:w="1958"/>
+            <w:vAlign w:val="top"/>
+          </w:tcPr>
+          <w:p>
+            <w:r>
+              <w:t>交互与控制</w:t>
+            </w:r>
+          </w:p>
+        </w:tc>
+        <w:tc>
+          <w:tcPr>
+            <w:tcW w:type="dxa" w:w="1958"/>
+            <w:vAlign w:val="top"/>
+          </w:tcPr>
+          <w:p>
+            <w:r>
+              <w:t>API/本地模式切换；故障类型选择；单设备故障/恢复；仿真重置；产线新增、编辑、删除；按钮、弹窗、表单、确认态全部可用。</w:t>
+            </w:r>
+          </w:p>
+        </w:tc>
+        <w:tc>
+          <w:tcPr>
+            <w:tcW w:type="dxa" w:w="1958"/>
+            <w:vAlign w:val="top"/>
+          </w:tcPr>
+          <w:p>
+            <w:r>
+              <w:t>浏览器操作录屏或截图；接口响应；前后端联调测试。</w:t>
+            </w:r>
+          </w:p>
+        </w:tc>
+        <w:tc>
+          <w:tcPr>
+            <w:tcW w:type="dxa" w:w="1958"/>
+            <w:vAlign w:val="top"/>
+          </w:tcPr>
+          <w:p>
+            <w:r>
+              <w:t>P0</w:t>
+            </w:r>
+          </w:p>
+        </w:tc>
+      </w:tr>
+      <w:tr>
+        <w:trPr>
+          <w:cantSplit/>
+        </w:trPr>
+        <w:tc>
+          <w:tcPr>
+            <w:tcW w:type="dxa" w:w="1958"/>
+            <w:vAlign w:val="top"/>
+          </w:tcPr>
+          <w:p>
+            <w:r>
+              <w:t>2</w:t>
+            </w:r>
+          </w:p>
+        </w:tc>
+        <w:tc>
+          <w:tcPr>
+            <w:tcW w:type="dxa" w:w="1958"/>
+            <w:vAlign w:val="top"/>
+          </w:tcPr>
+          <w:p>
+            <w:r>
+              <w:t>主数据底座</w:t>
+            </w:r>
+          </w:p>
+        </w:tc>
+        <w:tc>
+          <w:tcPr>
+            <w:tcW w:type="dxa" w:w="1958"/>
+            <w:vAlign w:val="top"/>
+          </w:tcPr>
+          <w:p>
+            <w:r>
+              <w:t>工厂、车间、产线、设备、产品、工艺、班次、日历及设备-产线绑定；统一ID映射和校验。</w:t>
+            </w:r>
+          </w:p>
+        </w:tc>
+        <w:tc>
+          <w:tcPr>
+            <w:tcW w:type="dxa" w:w="1958"/>
+            <w:vAlign w:val="top"/>
+          </w:tcPr>
+          <w:p>
+            <w:r>
+              <w:t>CRUD接口、迁移脚本、契约测试、初始化数据。</w:t>
+            </w:r>
+          </w:p>
+        </w:tc>
+        <w:tc>
+          <w:tcPr>
+            <w:tcW w:type="dxa" w:w="1958"/>
+            <w:vAlign w:val="top"/>
+          </w:tcPr>
+          <w:p>
+            <w:r>
+              <w:t>P0</w:t>
+            </w:r>
+          </w:p>
+        </w:tc>
+      </w:tr>
+      <w:tr>
+        <w:trPr>
+          <w:cantSplit/>
+        </w:trPr>
+        <w:tc>
+          <w:tcPr>
+            <w:tcW w:type="dxa" w:w="1958"/>
+            <w:vAlign w:val="top"/>
+          </w:tcPr>
+          <w:p>
+            <w:r>
+              <w:t>3</w:t>
+            </w:r>
+          </w:p>
+        </w:tc>
+        <w:tc>
+          <w:tcPr>
+            <w:tcW w:type="dxa" w:w="1958"/>
+            <w:vAlign w:val="top"/>
+          </w:tcPr>
+          <w:p>
+            <w:r>
+              <w:t>采集与故障闭环</w:t>
+            </w:r>
+          </w:p>
+        </w:tc>
+        <w:tc>
+          <w:tcPr>
+            <w:tcW w:type="dxa" w:w="1958"/>
+            <w:vAlign w:val="top"/>
+          </w:tcPr>
+          <w:p>
+            <w:r>
+              <w:t>MQTT连接、订阅、校验、幂等、乱序/延迟处理、缓存、告警去重、重连；故障生成alarm.created和alarm.cleared。</w:t>
+            </w:r>
+          </w:p>
+        </w:tc>
+        <w:tc>
+          <w:tcPr>
+            <w:tcW w:type="dxa" w:w="1958"/>
+            <w:vAlign w:val="top"/>
+          </w:tcPr>
+          <w:p>
+            <w:r>
+              <w:t>断线/重连/重复消息测试；告警前后状态对比。</w:t>
+            </w:r>
+          </w:p>
+        </w:tc>
+        <w:tc>
+          <w:tcPr>
+            <w:tcW w:type="dxa" w:w="1958"/>
+            <w:vAlign w:val="top"/>
+          </w:tcPr>
+          <w:p>
+            <w:r>
+              <w:t>P0</w:t>
+            </w:r>
+          </w:p>
+        </w:tc>
+      </w:tr>
+      <w:tr>
+        <w:trPr>
+          <w:cantSplit/>
+        </w:trPr>
+        <w:tc>
+          <w:tcPr>
+            <w:tcW w:type="dxa" w:w="1958"/>
+            <w:vAlign w:val="top"/>
+          </w:tcPr>
+          <w:p>
+            <w:r>
+              <w:t>4</w:t>
+            </w:r>
+          </w:p>
+        </w:tc>
+        <w:tc>
+          <w:tcPr>
+            <w:tcW w:type="dxa" w:w="1958"/>
+            <w:vAlign w:val="top"/>
+          </w:tcPr>
+          <w:p>
+            <w:r>
+              <w:t>生产执行</w:t>
+            </w:r>
+          </w:p>
+        </w:tc>
+        <w:tc>
+          <w:tcPr>
+            <w:tcW w:type="dxa" w:w="1958"/>
+            <w:vAlign w:val="top"/>
+          </w:tcPr>
+          <w:p>
+            <w:r>
+              <w:t>订单→工单→产线分配→开始→报工→检验→完成；暂停、恢复、取消、异常原因和延期风险。</w:t>
+            </w:r>
+          </w:p>
+        </w:tc>
+        <w:tc>
+          <w:tcPr>
+            <w:tcW w:type="dxa" w:w="1958"/>
+            <w:vAlign w:val="top"/>
+          </w:tcPr>
+          <w:p>
+            <w:r>
+              <w:t>四条产线并行工单场景；报工数量和状态机测试。</w:t>
+            </w:r>
+          </w:p>
+        </w:tc>
+        <w:tc>
+          <w:tcPr>
+            <w:tcW w:type="dxa" w:w="1958"/>
+            <w:vAlign w:val="top"/>
+          </w:tcPr>
+          <w:p>
+            <w:r>
+              <w:t>P0</w:t>
+            </w:r>
+          </w:p>
+        </w:tc>
+      </w:tr>
+      <w:tr>
+        <w:trPr>
+          <w:cantSplit/>
+        </w:trPr>
+        <w:tc>
+          <w:tcPr>
+            <w:tcW w:type="dxa" w:w="1958"/>
+            <w:vAlign w:val="top"/>
+          </w:tcPr>
+          <w:p>
+            <w:r>
+              <w:t>5</w:t>
+            </w:r>
+          </w:p>
+        </w:tc>
+        <w:tc>
+          <w:tcPr>
+            <w:tcW w:type="dxa" w:w="1958"/>
+            <w:vAlign w:val="top"/>
+          </w:tcPr>
+          <w:p>
+            <w:r>
+              <w:t>数字孪生看板</w:t>
+            </w:r>
+          </w:p>
+        </w:tc>
+        <w:tc>
+          <w:tcPr>
+            <w:tcW w:type="dxa" w:w="1958"/>
+            <w:vAlign w:val="top"/>
+          </w:tcPr>
+          <w:p>
+            <w:r>
+              <w:t>真实读取API数据；产线切换；设备详情；故障高亮、离线灰显、告警刷新、OEE/进度更新；导航上下滚动、三维拖拽、缩放、点击。</w:t>
+            </w:r>
+          </w:p>
+        </w:tc>
+        <w:tc>
+          <w:tcPr>
+            <w:tcW w:type="dxa" w:w="1958"/>
+            <w:vAlign w:val="top"/>
+          </w:tcPr>
+          <w:p>
+            <w:r>
+              <w:t>页面交互清单逐项通过；无静态假数据冒充实时数据。</w:t>
+            </w:r>
+          </w:p>
+        </w:tc>
+        <w:tc>
+          <w:tcPr>
+            <w:tcW w:type="dxa" w:w="1958"/>
+            <w:vAlign w:val="top"/>
+          </w:tcPr>
+          <w:p>
+            <w:r>
+              <w:t>P0</w:t>
+            </w:r>
+          </w:p>
+        </w:tc>
+      </w:tr>
+      <w:tr>
+        <w:trPr>
+          <w:cantSplit/>
+        </w:trPr>
+        <w:tc>
+          <w:tcPr>
+            <w:tcW w:type="dxa" w:w="1958"/>
+            <w:vAlign w:val="top"/>
+          </w:tcPr>
+          <w:p>
+            <w:r>
+              <w:t>6</w:t>
+            </w:r>
+          </w:p>
+        </w:tc>
+        <w:tc>
+          <w:tcPr>
+            <w:tcW w:type="dxa" w:w="1958"/>
+            <w:vAlign w:val="top"/>
+          </w:tcPr>
+          <w:p>
+            <w:r>
+              <w:t>图纸、表单与视觉</w:t>
+            </w:r>
+          </w:p>
+        </w:tc>
+        <w:tc>
+          <w:tcPr>
+            <w:tcW w:type="dxa" w:w="1958"/>
+            <w:vAlign w:val="top"/>
+          </w:tcPr>
+          <w:p>
+            <w:r>
+              <w:t>PDF/图片/CAD上传、版本、预览、指纹；OCR/视觉结果草稿；人工确认；检验、点检、质量表单及附件审计。</w:t>
+            </w:r>
+          </w:p>
+        </w:tc>
+        <w:tc>
+          <w:tcPr>
+            <w:tcW w:type="dxa" w:w="1958"/>
+            <w:vAlign w:val="top"/>
+          </w:tcPr>
+          <w:p>
+            <w:r>
+              <w:t>上传样例、解析结果、人工确认、版本绑定和失败重试记录。</w:t>
+            </w:r>
+          </w:p>
+        </w:tc>
+        <w:tc>
+          <w:tcPr>
+            <w:tcW w:type="dxa" w:w="1958"/>
+            <w:vAlign w:val="top"/>
+          </w:tcPr>
+          <w:p>
+            <w:r>
+              <w:t>P1</w:t>
+            </w:r>
+          </w:p>
+        </w:tc>
+      </w:tr>
+      <w:tr>
+        <w:trPr>
+          <w:cantSplit/>
+        </w:trPr>
+        <w:tc>
+          <w:tcPr>
+            <w:tcW w:type="dxa" w:w="1958"/>
+            <w:vAlign w:val="top"/>
+          </w:tcPr>
+          <w:p>
+            <w:r>
+              <w:t>7</w:t>
+            </w:r>
+          </w:p>
+        </w:tc>
+        <w:tc>
+          <w:tcPr>
+            <w:tcW w:type="dxa" w:w="1958"/>
+            <w:vAlign w:val="top"/>
+          </w:tcPr>
+          <w:p>
+            <w:r>
+              <w:t>策略引擎</w:t>
+            </w:r>
+          </w:p>
+        </w:tc>
+        <w:tc>
+          <w:tcPr>
+            <w:tcW w:type="dxa" w:w="1958"/>
+            <w:vAlign w:val="top"/>
+          </w:tcPr>
+          <w:p>
+            <w:r>
+              <w:t>故障转移、负载均衡、物料短缺、维修恢复、延期风险五类策略；快照、候选方案、评分、影响评估、可解释原因。</w:t>
+            </w:r>
+          </w:p>
+        </w:tc>
+        <w:tc>
+          <w:tcPr>
+            <w:tcW w:type="dxa" w:w="1958"/>
+            <w:vAlign w:val="top"/>
+          </w:tcPr>
+          <w:p>
+            <w:r>
+              <w:t>固定seed回放；方案结果可复现；requiresApproval=true。</w:t>
+            </w:r>
+          </w:p>
+        </w:tc>
+        <w:tc>
+          <w:tcPr>
+            <w:tcW w:type="dxa" w:w="1958"/>
+            <w:vAlign w:val="top"/>
+          </w:tcPr>
+          <w:p>
+            <w:r>
+              <w:t>P0</w:t>
+            </w:r>
+          </w:p>
+        </w:tc>
+      </w:tr>
+      <w:tr>
+        <w:trPr>
+          <w:cantSplit/>
+        </w:trPr>
+        <w:tc>
+          <w:tcPr>
+            <w:tcW w:type="dxa" w:w="1958"/>
+            <w:vAlign w:val="top"/>
+          </w:tcPr>
+          <w:p>
+            <w:r>
+              <w:t>8</w:t>
+            </w:r>
+          </w:p>
+        </w:tc>
+        <w:tc>
+          <w:tcPr>
+            <w:tcW w:type="dxa" w:w="1958"/>
+            <w:vAlign w:val="top"/>
+          </w:tcPr>
+          <w:p>
+            <w:r>
+              <w:t>审批、权限与审计</w:t>
+            </w:r>
+          </w:p>
+        </w:tc>
+        <w:tc>
+          <w:tcPr>
+            <w:tcW w:type="dxa" w:w="1958"/>
+            <w:vAlign w:val="top"/>
+          </w:tcPr>
+          <w:p>
+            <w:r>
+              <w:t>厂长/班组长/设备员/操作员角色；工厂/车间/产线/设备数据范围；控制审批；记录人、对象、前后值、原因、traceId和结果。</w:t>
+            </w:r>
+          </w:p>
+        </w:tc>
+        <w:tc>
+          <w:tcPr>
+            <w:tcW w:type="dxa" w:w="1958"/>
+            <w:vAlign w:val="top"/>
+          </w:tcPr>
+          <w:p>
+            <w:r>
+              <w:t>未授权请求拒绝；控制动作审计查询；高风险动作不可直执行。</w:t>
+            </w:r>
+          </w:p>
+        </w:tc>
+        <w:tc>
+          <w:tcPr>
+            <w:tcW w:type="dxa" w:w="1958"/>
+            <w:vAlign w:val="top"/>
+          </w:tcPr>
+          <w:p>
+            <w:r>
+              <w:t>P0</w:t>
+            </w:r>
+          </w:p>
+        </w:tc>
+      </w:tr>
+      <w:tr>
+        <w:trPr>
+          <w:cantSplit/>
+        </w:trPr>
+        <w:tc>
+          <w:tcPr>
+            <w:tcW w:type="dxa" w:w="1958"/>
+            <w:vAlign w:val="top"/>
+          </w:tcPr>
+          <w:p>
+            <w:r>
+              <w:t>9</w:t>
+            </w:r>
+          </w:p>
+        </w:tc>
+        <w:tc>
+          <w:tcPr>
+            <w:tcW w:type="dxa" w:w="1958"/>
+            <w:vAlign w:val="top"/>
+          </w:tcPr>
+          <w:p>
+            <w:r>
+              <w:t>桌面运行与发布</w:t>
+            </w:r>
+          </w:p>
+        </w:tc>
+        <w:tc>
+          <w:tcPr>
+            <w:tcW w:type="dxa" w:w="1958"/>
+            <w:vAlign w:val="top"/>
+          </w:tcPr>
+          <w:p>
+            <w:r>
+              <w:t>Tauri app/dmg实际打开；双击编排服务；ready探测；单实例；窗口关闭清理子进程；缩放、拖拽、滚轮；失败提示、日志和回滚。</w:t>
+            </w:r>
+          </w:p>
+        </w:tc>
+        <w:tc>
+          <w:tcPr>
+            <w:tcW w:type="dxa" w:w="1958"/>
+            <w:vAlign w:val="top"/>
+          </w:tcPr>
+          <w:p>
+            <w:r>
+              <w:t>macOS app/dmg smoke；进程、端口、PID清理证据。</w:t>
+            </w:r>
+          </w:p>
+        </w:tc>
+        <w:tc>
+          <w:tcPr>
+            <w:tcW w:type="dxa" w:w="1958"/>
+            <w:vAlign w:val="top"/>
+          </w:tcPr>
+          <w:p>
+            <w:r>
+              <w:t>P0</w:t>
+            </w:r>
+          </w:p>
+        </w:tc>
+      </w:tr>
+      <w:tr>
+        <w:trPr>
+          <w:cantSplit/>
+        </w:trPr>
+        <w:tc>
+          <w:tcPr>
+            <w:tcW w:type="dxa" w:w="1958"/>
+            <w:vAlign w:val="top"/>
+          </w:tcPr>
+          <w:p>
+            <w:r>
+              <w:t>10</w:t>
+            </w:r>
+          </w:p>
+        </w:tc>
+        <w:tc>
+          <w:tcPr>
+            <w:tcW w:type="dxa" w:w="1958"/>
+            <w:vAlign w:val="top"/>
+          </w:tcPr>
+          <w:p>
+            <w:r>
+              <w:t>质量与交付</w:t>
+            </w:r>
+          </w:p>
+        </w:tc>
+        <w:tc>
+          <w:tcPr>
+            <w:tcW w:type="dxa" w:w="1958"/>
+            <w:vAlign w:val="top"/>
+          </w:tcPr>
+          <w:p>
+            <w:r>
+              <w:t>单元、接口、集成、场景、恢复、安装包和人工验收；备份恢复；运行手册、故障手册、接口文档、版本记录。</w:t>
+            </w:r>
+          </w:p>
+        </w:tc>
+        <w:tc>
+          <w:tcPr>
+            <w:tcW w:type="dxa" w:w="1958"/>
+            <w:vAlign w:val="top"/>
+          </w:tcPr>
+          <w:p>
+            <w:r>
+              <w:t>verify-all、browser-smoke、desktop-smoke及测试报告。</w:t>
+            </w:r>
+          </w:p>
+        </w:tc>
+        <w:tc>
+          <w:tcPr>
+            <w:tcW w:type="dxa" w:w="1958"/>
+            <w:vAlign w:val="top"/>
+          </w:tcPr>
+          <w:p>
+            <w:r>
+              <w:t>P0</w:t>
+            </w:r>
+          </w:p>
+        </w:tc>
+      </w:tr>
+    </w:tbl>
+    <w:p/>
+    <w:p>
+      <w:pPr>
+        <w:pStyle w:val="4"/>
+      </w:pPr>
+      <w:r>
+        <w:t>12.3 推荐实施顺序与里程碑</w:t>
+      </w:r>
+    </w:p>
+    <w:tbl>
+      <w:tblPr>
+        <w:tblStyle w:val="33"/>
+        <w:tblW w:type="auto" w:w="0"/>
+        <w:jc w:val="center"/>
+        <w:tblLook w:firstColumn="1" w:firstRow="1" w:lastColumn="0" w:lastRow="0" w:noHBand="0" w:noVBand="1" w:val="04A0"/>
+      </w:tblPr>
+      <w:tblGrid>
+        <w:gridCol w:w="2448"/>
+        <w:gridCol w:w="2448"/>
+        <w:gridCol w:w="2448"/>
+        <w:gridCol w:w="2448"/>
+      </w:tblGrid>
+      <w:tr>
+        <w:trPr>
+          <w:tblHeader w:val="true"/>
+          <w:cantSplit/>
+        </w:trPr>
+        <w:tc>
+          <w:tcPr>
+            <w:tcW w:type="dxa" w:w="2448"/>
+            <w:vAlign w:val="center"/>
+          </w:tcPr>
+          <w:p>
+            <w:r>
+              <w:rPr>
+                <w:b/>
+              </w:rPr>
+              <w:t>里程碑</w:t>
+            </w:r>
+          </w:p>
+        </w:tc>
+        <w:tc>
+          <w:tcPr>
+            <w:tcW w:type="dxa" w:w="2448"/>
+            <w:vAlign w:val="center"/>
+          </w:tcPr>
+          <w:p>
+            <w:r>
+              <w:rPr>
+                <w:b/>
+              </w:rPr>
+              <w:t>预计工期</w:t>
+            </w:r>
+          </w:p>
+        </w:tc>
+        <w:tc>
+          <w:tcPr>
+            <w:tcW w:type="dxa" w:w="2448"/>
+            <w:vAlign w:val="center"/>
+          </w:tcPr>
+          <w:p>
+            <w:r>
+              <w:rPr>
+                <w:b/>
+              </w:rPr>
+              <w:t>工作内容</w:t>
+            </w:r>
+          </w:p>
+        </w:tc>
+        <w:tc>
+          <w:tcPr>
+            <w:tcW w:type="dxa" w:w="2448"/>
+            <w:vAlign w:val="center"/>
+          </w:tcPr>
+          <w:p>
+            <w:r>
+              <w:rPr>
+                <w:b/>
+              </w:rPr>
+              <w:t>退出条件</w:t>
+            </w:r>
+          </w:p>
+        </w:tc>
+      </w:tr>
+      <w:tr>
+        <w:trPr>
+          <w:cantSplit/>
+        </w:trPr>
+        <w:tc>
+          <w:tcPr>
+            <w:tcW w:type="dxa" w:w="2448"/>
+            <w:vAlign w:val="top"/>
+          </w:tcPr>
+          <w:p>
+            <w:r>
+              <w:t>M1 可控演示闭环</w:t>
+            </w:r>
+          </w:p>
+        </w:tc>
+        <w:tc>
+          <w:tcPr>
+            <w:tcW w:type="dxa" w:w="2448"/>
+            <w:vAlign w:val="top"/>
+          </w:tcPr>
+          <w:p>
+            <w:r>
+              <w:t>3～5个工作日</w:t>
+            </w:r>
+          </w:p>
+        </w:tc>
+        <w:tc>
+          <w:tcPr>
+            <w:tcW w:type="dxa" w:w="2448"/>
+            <w:vAlign w:val="top"/>
+          </w:tcPr>
+          <w:p>
+            <w:r>
+              <w:t>修复所有无效按钮；完成API/本地切换、故障注入/恢复、产线CRUD；重建并覆盖旧桌面包。</w:t>
+            </w:r>
+          </w:p>
+        </w:tc>
+        <w:tc>
+          <w:tcPr>
+            <w:tcW w:type="dxa" w:w="2448"/>
+            <w:vAlign w:val="top"/>
+          </w:tcPr>
+          <w:p>
+            <w:r>
+              <w:t>故障注入→告警→看板高亮→恢复全链路通过。</w:t>
+            </w:r>
+          </w:p>
+        </w:tc>
+      </w:tr>
+      <w:tr>
+        <w:trPr>
+          <w:cantSplit/>
+        </w:trPr>
+        <w:tc>
+          <w:tcPr>
+            <w:tcW w:type="dxa" w:w="2448"/>
+            <w:vAlign w:val="top"/>
+          </w:tcPr>
+          <w:p>
+            <w:r>
+              <w:t>M2 数据与生产底座</w:t>
+            </w:r>
+          </w:p>
+        </w:tc>
+        <w:tc>
+          <w:tcPr>
+            <w:tcW w:type="dxa" w:w="2448"/>
+            <w:vAlign w:val="top"/>
+          </w:tcPr>
+          <w:p>
+            <w:r>
+              <w:t>5～8个工作日</w:t>
+            </w:r>
+          </w:p>
+        </w:tc>
+        <w:tc>
+          <w:tcPr>
+            <w:tcW w:type="dxa" w:w="2448"/>
+            <w:vAlign w:val="top"/>
+          </w:tcPr>
+          <w:p>
+            <w:r>
+              <w:t>PostgreSQL迁移、主数据、持久化、重启恢复、工单状态机和报工校验。</w:t>
+            </w:r>
+          </w:p>
+        </w:tc>
+        <w:tc>
+          <w:tcPr>
+            <w:tcW w:type="dxa" w:w="2448"/>
+            <w:vAlign w:val="top"/>
+          </w:tcPr>
+          <w:p>
+            <w:r>
+              <w:t>后端重启后状态不丢；四条产线并行生产可回放。</w:t>
+            </w:r>
+          </w:p>
+        </w:tc>
+      </w:tr>
+      <w:tr>
+        <w:trPr>
+          <w:cantSplit/>
+        </w:trPr>
+        <w:tc>
+          <w:tcPr>
+            <w:tcW w:type="dxa" w:w="2448"/>
+            <w:vAlign w:val="top"/>
+          </w:tcPr>
+          <w:p>
+            <w:r>
+              <w:t>M3 看板与质量能力</w:t>
+            </w:r>
+          </w:p>
+        </w:tc>
+        <w:tc>
+          <w:tcPr>
+            <w:tcW w:type="dxa" w:w="2448"/>
+            <w:vAlign w:val="top"/>
+          </w:tcPr>
+          <w:p>
+            <w:r>
+              <w:t>5～8个工作日</w:t>
+            </w:r>
+          </w:p>
+        </w:tc>
+        <w:tc>
+          <w:tcPr>
+            <w:tcW w:type="dxa" w:w="2448"/>
+            <w:vAlign w:val="top"/>
+          </w:tcPr>
+          <w:p>
+            <w:r>
+              <w:t>数字孪生动态化、OEE、图纸/表单、点检和质量记录、上传失败重试。</w:t>
+            </w:r>
+          </w:p>
+        </w:tc>
+        <w:tc>
+          <w:tcPr>
+            <w:tcW w:type="dxa" w:w="2448"/>
+            <w:vAlign w:val="top"/>
+          </w:tcPr>
+          <w:p>
+            <w:r>
+              <w:t>页面不依赖静态数据；质量记录可追溯到批次和设备。</w:t>
+            </w:r>
+          </w:p>
+        </w:tc>
+      </w:tr>
+      <w:tr>
+        <w:trPr>
+          <w:cantSplit/>
+        </w:trPr>
+        <w:tc>
+          <w:tcPr>
+            <w:tcW w:type="dxa" w:w="2448"/>
+            <w:vAlign w:val="top"/>
+          </w:tcPr>
+          <w:p>
+            <w:r>
+              <w:t>M4 策略与治理</w:t>
+            </w:r>
+          </w:p>
+        </w:tc>
+        <w:tc>
+          <w:tcPr>
+            <w:tcW w:type="dxa" w:w="2448"/>
+            <w:vAlign w:val="top"/>
+          </w:tcPr>
+          <w:p>
+            <w:r>
+              <w:t>5～8个工作日</w:t>
+            </w:r>
+          </w:p>
+        </w:tc>
+        <w:tc>
+          <w:tcPr>
+            <w:tcW w:type="dxa" w:w="2448"/>
+            <w:vAlign w:val="top"/>
+          </w:tcPr>
+          <w:p>
+            <w:r>
+              <w:t>策略引擎五类场景、影响评估、审批、权限、审计和结果追踪。</w:t>
+            </w:r>
+          </w:p>
+        </w:tc>
+        <w:tc>
+          <w:tcPr>
+            <w:tcW w:type="dxa" w:w="2448"/>
+            <w:vAlign w:val="top"/>
+          </w:tcPr>
+          <w:p>
+            <w:r>
+              <w:t>策略只给建议；所有控制动作有授权和审计。</w:t>
+            </w:r>
+          </w:p>
+        </w:tc>
+      </w:tr>
+      <w:tr>
+        <w:trPr>
+          <w:cantSplit/>
+        </w:trPr>
+        <w:tc>
+          <w:tcPr>
+            <w:tcW w:type="dxa" w:w="2448"/>
+            <w:vAlign w:val="top"/>
+          </w:tcPr>
+          <w:p>
+            <w:r>
+              <w:t>M5 桌面试点冻结</w:t>
+            </w:r>
+          </w:p>
+        </w:tc>
+        <w:tc>
+          <w:tcPr>
+            <w:tcW w:type="dxa" w:w="2448"/>
+            <w:vAlign w:val="top"/>
+          </w:tcPr>
+          <w:p>
+            <w:r>
+              <w:t>4～6个工作日</w:t>
+            </w:r>
+          </w:p>
+        </w:tc>
+        <w:tc>
+          <w:tcPr>
+            <w:tcW w:type="dxa" w:w="2448"/>
+            <w:vAlign w:val="top"/>
+          </w:tcPr>
+          <w:p>
+            <w:r>
+              <w:t>安装包、服务编排、单实例、清理、恢复、全量回归、运行手册和发布包。</w:t>
+            </w:r>
+          </w:p>
+        </w:tc>
+        <w:tc>
+          <w:tcPr>
+            <w:tcW w:type="dxa" w:w="2448"/>
+            <w:vAlign w:val="top"/>
+          </w:tcPr>
+          <w:p>
+            <w:r>
+              <w:t>P0全部关闭；可在无真实设备环境重复演示和验收。</w:t>
+            </w:r>
+          </w:p>
+        </w:tc>
+      </w:tr>
+    </w:tbl>
+    <w:p/>
+    <w:p>
+      <w:pPr>
+        <w:pStyle w:val="4"/>
+      </w:pPr>
+      <w:r>
+        <w:t>12.4 单人执行分工与并行方式</w:t>
+      </w:r>
+    </w:p>
+    <w:p>
+      <w:r>
+        <w:t>赵丞仍是唯一实现者，但按以下角色切换工作上下文，避免边写边改造成互相覆盖：</w:t>
+      </w:r>
+    </w:p>
+    <w:p>
+      <w:pPr>
+        <w:pStyle w:val="16"/>
+      </w:pPr>
+      <w:r>
+        <w:t>产品/架构角色：冻结接口、状态机、权限边界和验收清单；先写契约再编码。</w:t>
+      </w:r>
+    </w:p>
+    <w:p>
+      <w:pPr>
+        <w:pStyle w:val="16"/>
+      </w:pPr>
+      <w:r>
+        <w:t>后端/采集角色：负责NestJS、MQTT、PostgreSQL、告警、控制和审计；所有写接口显式校验并返回明确错误。</w:t>
+      </w:r>
+    </w:p>
+    <w:p>
+      <w:pPr>
+        <w:pStyle w:val="16"/>
+      </w:pPr>
+      <w:r>
+        <w:t>前端/孪生角色：负责真实API接入、交互状态、滚动/拖拽/缩放和桌面适配；禁止用静态常量掩盖接口失败。</w:t>
+      </w:r>
+    </w:p>
+    <w:p>
+      <w:pPr>
+        <w:pStyle w:val="16"/>
+      </w:pPr>
+      <w:r>
+        <w:t>策略角色：只读快照、生成候选方案和评估结果；任何执行必须经过审批工具。</w:t>
+      </w:r>
+    </w:p>
+    <w:p>
+      <w:pPr>
+        <w:pStyle w:val="16"/>
+      </w:pPr>
+      <w:r>
+        <w:t>测试/发布角色：每个里程碑末尾执行全量回归、启动/停止验证和人工点击清单，再决定是否合并。</w:t>
+      </w:r>
+    </w:p>
+    <w:p>
+      <w:pPr>
+        <w:pStyle w:val="4"/>
+      </w:pPr>
+      <w:r>
+        <w:t>12.5 风险闸门</w:t>
+      </w:r>
+    </w:p>
+    <w:p>
+      <w:pPr>
+        <w:pStyle w:val="16"/>
+      </w:pPr>
+      <w:r>
+        <w:t>生产安全闸门：没有权限、确认和审计的控制接口不得接入真实设备。</w:t>
+      </w:r>
+    </w:p>
+    <w:p>
+      <w:pPr>
+        <w:pStyle w:val="16"/>
+      </w:pPr>
+      <w:r>
+        <w:t>数据闸门：没有幂等、时间戳、质量码和恢复策略的采集数据不得进入生产统计。</w:t>
+      </w:r>
+    </w:p>
+    <w:p>
+      <w:pPr>
+        <w:pStyle w:val="16"/>
+      </w:pPr>
+      <w:r>
+        <w:t>交互闸门：按钮无响应、错误不提示、加载态不可恢复，均视为未完成。</w:t>
+      </w:r>
+    </w:p>
+    <w:p>
+      <w:pPr>
+        <w:pStyle w:val="16"/>
+      </w:pPr>
+      <w:r>
+        <w:t>发布闸门：只验证结构的desktop-smoke不能替代真实app/dmg双击、关闭和重启验证。</w:t>
+      </w:r>
+    </w:p>
+    <w:p>
+      <w:pPr>
+        <w:pStyle w:val="16"/>
+      </w:pPr>
+      <w:r>
+        <w:t>范围闸门：SaaS和Nanobot继续后置，不能挤占核心MES与仿真闭环工期。</w:t>
+      </w:r>
+    </w:p>
+    <w:p>
+      <w:pPr>
+        <w:pStyle w:val="4"/>
+      </w:pPr>
+      <w:r>
+        <w:t>12.6 下一步立即执行</w:t>
+      </w:r>
+    </w:p>
+    <w:p>
+      <w:pPr/>
+      <w:r>
+        <w:t>1. 先清点并修复当前页面所有无效按钮，建立“按钮→接口→状态更新→错误反馈”映射表。</w:t>
+      </w:r>
+    </w:p>
+    <w:p>
+      <w:pPr/>
+      <w:r>
+        <w:t>2. 完成 API 模式下按设备/产线范围的故障恢复和重置，不允许全局重置误伤其他产线。</w:t>
+      </w:r>
+    </w:p>
+    <w:p>
+      <w:pPr/>
+      <w:r>
+        <w:t>3. 将产线和设备主数据落到 PostgreSQL，补齐迁移、初始化和重启恢复。</w:t>
+      </w:r>
+    </w:p>
+    <w:p>
+      <w:pPr/>
+      <w:r>
+        <w:t>4. 每次代码变更自动执行本地桌面重建，覆盖旧 app 后再做人工验证。</w:t>
+      </w:r>
+    </w:p>
+    <w:p>
+      <w:pPr/>
+      <w:r>
+        <w:t>5. 完成本阶段后再进入图纸/表单、策略审批和生产冻结，不提前扩展 SaaS。</w:t>
+      </w:r>
+    </w:p>
+    <w:p>
+      <w:r>
+        <w:t>计划版本：核心MES试点阶段 v1.1　负责人：赵丞　开发模式：单人全栈　更新日期：2026-08-29</w:t>
       </w:r>
     </w:p>
     <w:sectPr>

</xml_diff>